<commit_message>
fix: remove practice exam from courseware
</commit_message>
<xml_diff>
--- a/courseware/LG-Advanced Transactional Accounting with QuickBooks Online.docx
+++ b/courseware/LG-Advanced Transactional Accounting with QuickBooks Online.docx
@@ -120,7 +120,7 @@
           <w:color w:val="5B6573"/>
           <w:sz w:val="22"/>
         </w:rPr>
-        <w:t>Version 11.0 · 16 August 2026</w:t>
+        <w:t>Version 11.1 · 16 August 2026</w:t>
       </w:r>
     </w:p>
     <w:p>
@@ -291,6 +291,52 @@
           <w:p>
             <w:r>
               <w:t>Rebuilt Learner Guide with advanced QuickBooks Online controls, detailed activities, current Singapore GST context, SFRS(I)/FRS framing, and cross-artifact assessment alignment.</w:t>
+            </w:r>
+          </w:p>
+        </w:tc>
+        <w:tc>
+          <w:tcPr>
+            <w:tcW w:type="dxa" w:w="2498"/>
+            <w:vAlign w:val="center"/>
+          </w:tcPr>
+          <w:p>
+            <w:r>
+              <w:t>Dr Alfred Ang</w:t>
+            </w:r>
+          </w:p>
+        </w:tc>
+      </w:tr>
+      <w:tr>
+        <w:tc>
+          <w:tcPr>
+            <w:tcW w:type="dxa" w:w="2498"/>
+            <w:vAlign w:val="center"/>
+          </w:tcPr>
+          <w:p>
+            <w:r>
+              <w:t>11.1</w:t>
+            </w:r>
+          </w:p>
+        </w:tc>
+        <w:tc>
+          <w:tcPr>
+            <w:tcW w:type="dxa" w:w="2498"/>
+            <w:vAlign w:val="center"/>
+          </w:tcPr>
+          <w:p>
+            <w:r>
+              <w:t>16 August 2026</w:t>
+            </w:r>
+          </w:p>
+        </w:tc>
+        <w:tc>
+          <w:tcPr>
+            <w:tcW w:type="dxa" w:w="2498"/>
+            <w:vAlign w:val="center"/>
+          </w:tcPr>
+          <w:p>
+            <w:r>
+              <w:t>Removed the external practice-exam reference and refreshed dependent slide mappings.</w:t>
             </w:r>
           </w:p>
         </w:tc>

</xml_diff>